<commit_message>
docs: expand prospective collection plan
</commit_message>
<xml_diff>
--- a/docs/development/Aramina_Patient_Collection_and_Independent_Validation_Plan.docx
+++ b/docs/development/Aramina_Patient_Collection_and_Independent_Validation_Plan.docx
@@ -85,17 +85,7 @@
         <w:spacing w:after="40"/>
       </w:pPr>
       <w:r>
-        <w:rPr>
-          <w:b/>
-          <w:sz w:val="21"/>
-        </w:rPr>
-        <w:t xml:space="preserve">Date: </w:t>
-      </w:r>
-      <w:r>
-        <w:rPr>
-          <w:sz w:val="21"/>
-        </w:rPr>
-        <w:t>28 July 2026</w:t>
+        <w:t>Date: 29 July 2026</w:t>
       </w:r>
     </w:p>
     <w:p>
@@ -818,8 +808,50 @@
         <w:pStyle w:val="Heading1"/>
       </w:pPr>
       <w:r>
-        <w:lastRenderedPageBreak/>
-        <w:t>5. One-year recruitment rate</w:t>
+        <w:t>5. Wilson confidence intervals</w:t>
+      </w:r>
+    </w:p>
+    <w:p>
+      <w:pPr/>
+      <w:r>
+        <w:t>Sensitivity and specificity are binomial proportions. For sensitivity, x = TP and n = TP + FN. For specificity, x = TN and n = TN + FP. The observed proportion p-hat = x/n is a point estimate; the confidence interval quantifies sampling uncertainty around the unknown population value.</w:t>
+      </w:r>
+    </w:p>
+    <w:p>
+      <w:pPr/>
+      <w:r>
+        <w:rPr>
+          <w:rFonts w:ascii="Cambria Math" w:hAnsi="Cambria Math"/>
+        </w:rPr>
+        <w:t>Two-sided 95% Wilson score interval:</w:t>
+        <w:br/>
+        <w:t>[p-hat + z²/(2n) ± z × sqrt(p-hat(1-p-hat)/n + z²/(4n²))] / [1 + z²/n], where z = 1.96.</w:t>
+      </w:r>
+    </w:p>
+    <w:p>
+      <w:pPr/>
+      <w:r>
+        <w:t>Wilson is used because it remains within 0-100% and behaves better than the simple symmetric Wald interval when the number of positive cases is limited or the observed proportion is close to 0% or 100%. This matters for Aramina because sensitivity is expected to be near 95% and only about 20% of biopsy-referred patients are expected to have cancer.</w:t>
+      </w:r>
+    </w:p>
+    <w:p>
+      <w:pPr/>
+      <w:r>
+        <w:t>Example: 95 correct cancer classifications among 100 cancer cases gives sensitivity 95.0% with a Wilson 95% CI of approximately 88.8-97.8%. With 190 correct classifications among 200 cancer cases, the same point estimate gives a narrower interval of approximately 91.0-97.3%. Thus, precision depends on the number of cancer cases, not only on total cohort size.</w:t>
+      </w:r>
+    </w:p>
+    <w:p>
+      <w:pPr/>
+      <w:r>
+        <w:t>Wilson intervals quantify random sampling uncertainty; they do not correct selection bias, label error, protocol drift or site effects. Increasing sample size narrows the interval but does not remove these biases.</w:t>
+      </w:r>
+    </w:p>
+    <w:p>
+      <w:pPr>
+        <w:pStyle w:val="Heading1"/>
+      </w:pPr>
+      <w:r>
+        <w:t>6. One-year recruitment rate</w:t>
       </w:r>
     </w:p>
     <w:p>
@@ -1382,7 +1414,1055 @@
         <w:pStyle w:val="Heading1"/>
       </w:pPr>
       <w:r>
-        <w:t>6. Prospective sequence</w:t>
+        <w:t>7. Staged collection and saturation review</w:t>
+      </w:r>
+    </w:p>
+    <w:p>
+      <w:pPr/>
+      <w:r>
+        <w:t>Development data should be accumulated in consecutive batches of 50 analyzable patients. Each batch review should answer two separate questions: whether the collection protocol remains controlled, and whether additional development data still produce a meaningful improvement in generalization.</w:t>
+      </w:r>
+    </w:p>
+    <w:p>
+      <w:pPr>
+        <w:pStyle w:val="ListBullet"/>
+      </w:pPr>
+      <w:r>
+        <w:t>Data-quality review: recruited versus analyzable patients, missing histopathology, attenuation-coefficient completeness, SNR failures, retained measurements per breast, protocol deviations and calibration drift.</w:t>
+      </w:r>
+    </w:p>
+    <w:p>
+      <w:pPr>
+        <w:pStyle w:val="ListBullet"/>
+      </w:pPr>
+      <w:r>
+        <w:t>Cohort review: CANCER/BENIGN counts, age distribution, BI-RADS category, site, hardware version and coverage of predefined subgroups.</w:t>
+      </w:r>
+    </w:p>
+    <w:p>
+      <w:pPr>
+        <w:pStyle w:val="ListBullet"/>
+      </w:pPr>
+      <w:r>
+        <w:t>Model-learning review: use the same patient-safe evaluation protocol and track sensitivity, specificity, ROC AUC, balanced accuracy, Brier score, confusion matrix and confidence intervals.</w:t>
+      </w:r>
+    </w:p>
+    <w:p>
+      <w:pPr>
+        <w:pStyle w:val="ListBullet"/>
+      </w:pPr>
+      <w:r>
+        <w:t>Stability review: compare both point estimates and confidence-interval widths with the previous batch; investigate subgroup deterioration even when the overall metric appears stable.</w:t>
+      </w:r>
+    </w:p>
+    <w:p>
+      <w:pPr/>
+      <w:r>
+        <w:t>A plateau should not be declared from one favorable batch. A candidate operational rule is to begin formal saturation assessment only after at least 500 analyzable development patients and require three consecutive 50-patient reviews with only small prespecified changes in performance, no deterioration in the lower sensitivity confidence bound and adequate subgroup coverage. Exact delta limits must be approved in the statistical analysis plan before they are used as a stopping rule.</w:t>
+      </w:r>
+    </w:p>
+    <w:p>
+      <w:pPr/>
+      <w:r>
+        <w:t>Sequential outcome-based review applies only to model development. After model lock, the independent blind cohort must not be used for model updates or informal early stopping. Only data completeness and protocol compliance may be monitored unless a formal group-sequential validation design has been prospectively specified.</w:t>
+      </w:r>
+    </w:p>
+    <w:p>
+      <w:pPr>
+        <w:pStyle w:val="Heading1"/>
+      </w:pPr>
+      <w:r>
+        <w:t>8. Longitudinal measurement schedule</w:t>
+      </w:r>
+    </w:p>
+    <w:p>
+      <w:pPr/>
+      <w:r>
+        <w:t>The current product question is pre-biopsy decision support. Every patient should therefore have at least one technically valid XRD session after diagnostic mammography and before any invasive procedure. The preferred design adds a second pre-biopsy session immediately before needle insertion, allowing short-term pre-intervention change to be separated from post-biopsy inflammation.</w:t>
+      </w:r>
+    </w:p>
+    <w:tbl>
+      <w:tblPr>
+        <w:tblW w:type="auto" w:w="0"/>
+        <w:tblLayout w:type="fixed"/>
+        <w:tblLook w:firstColumn="1" w:firstRow="1" w:lastColumn="0" w:lastRow="0" w:noHBand="0" w:noVBand="1" w:val="04A0"/>
+      </w:tblPr>
+      <w:tblGrid>
+        <w:gridCol w:w="2340"/>
+        <w:gridCol w:w="2340"/>
+        <w:gridCol w:w="2340"/>
+        <w:gridCol w:w="2340"/>
+      </w:tblGrid>
+      <w:tr>
+        <w:trPr>
+          <w:tblHeader w:val="true"/>
+          <w:cantSplit/>
+        </w:trPr>
+        <w:tc>
+          <w:tcPr>
+            <w:tcW w:type="dxa" w:w="792"/>
+            <w:vAlign w:val="center"/>
+            <w:shd w:fill="D9EAF7"/>
+            <w:tcMar>
+              <w:top w:w="90" w:type="dxa"/>
+              <w:start w:w="90" w:type="dxa"/>
+              <w:bottom w:w="90" w:type="dxa"/>
+              <w:end w:w="90" w:type="dxa"/>
+            </w:tcMar>
+          </w:tcPr>
+          <w:p>
+            <w:pPr>
+              <w:spacing w:after="0"/>
+              <w:jc w:val="center"/>
+            </w:pPr>
+            <w:r>
+              <w:rPr>
+                <w:b/>
+                <w:sz w:val="18"/>
+              </w:rPr>
+              <w:t>Timepoint</w:t>
+            </w:r>
+          </w:p>
+        </w:tc>
+        <w:tc>
+          <w:tcPr>
+            <w:tcW w:type="dxa" w:w="3240"/>
+            <w:vAlign w:val="center"/>
+            <w:shd w:fill="D9EAF7"/>
+            <w:tcMar>
+              <w:top w:w="90" w:type="dxa"/>
+              <w:start w:w="90" w:type="dxa"/>
+              <w:bottom w:w="90" w:type="dxa"/>
+              <w:end w:w="90" w:type="dxa"/>
+            </w:tcMar>
+          </w:tcPr>
+          <w:p>
+            <w:pPr>
+              <w:spacing w:after="0"/>
+              <w:jc w:val="left"/>
+            </w:pPr>
+            <w:r>
+              <w:rPr>
+                <w:b/>
+                <w:sz w:val="18"/>
+              </w:rPr>
+              <w:t>Timing</w:t>
+            </w:r>
+          </w:p>
+        </w:tc>
+        <w:tc>
+          <w:tcPr>
+            <w:tcW w:type="dxa" w:w="1512"/>
+            <w:vAlign w:val="center"/>
+            <w:shd w:fill="D9EAF7"/>
+            <w:tcMar>
+              <w:top w:w="90" w:type="dxa"/>
+              <w:start w:w="90" w:type="dxa"/>
+              <w:bottom w:w="90" w:type="dxa"/>
+              <w:end w:w="90" w:type="dxa"/>
+            </w:tcMar>
+          </w:tcPr>
+          <w:p>
+            <w:pPr>
+              <w:spacing w:after="0"/>
+              <w:jc w:val="center"/>
+            </w:pPr>
+            <w:r>
+              <w:rPr>
+                <w:b/>
+                <w:sz w:val="18"/>
+              </w:rPr>
+              <w:t>Priority</w:t>
+            </w:r>
+          </w:p>
+        </w:tc>
+        <w:tc>
+          <w:tcPr>
+            <w:tcW w:type="dxa" w:w="3816"/>
+            <w:vAlign w:val="center"/>
+            <w:shd w:fill="D9EAF7"/>
+            <w:tcMar>
+              <w:top w:w="90" w:type="dxa"/>
+              <w:start w:w="90" w:type="dxa"/>
+              <w:bottom w:w="90" w:type="dxa"/>
+              <w:end w:w="90" w:type="dxa"/>
+            </w:tcMar>
+          </w:tcPr>
+          <w:p>
+            <w:pPr>
+              <w:spacing w:after="0"/>
+              <w:jc w:val="left"/>
+            </w:pPr>
+            <w:r>
+              <w:rPr>
+                <w:b/>
+                <w:sz w:val="18"/>
+              </w:rPr>
+              <w:t>Purpose</w:t>
+            </w:r>
+          </w:p>
+        </w:tc>
+      </w:tr>
+      <w:tr>
+        <w:trPr>
+          <w:cantSplit/>
+        </w:trPr>
+        <w:tc>
+          <w:tcPr>
+            <w:tcW w:type="dxa" w:w="792"/>
+            <w:vAlign w:val="center"/>
+            <w:tcMar>
+              <w:top w:w="90" w:type="dxa"/>
+              <w:start w:w="90" w:type="dxa"/>
+              <w:bottom w:w="90" w:type="dxa"/>
+              <w:end w:w="90" w:type="dxa"/>
+            </w:tcMar>
+          </w:tcPr>
+          <w:p>
+            <w:pPr>
+              <w:spacing w:after="0"/>
+              <w:jc w:val="center"/>
+            </w:pPr>
+            <w:r>
+              <w:rPr>
+                <w:sz w:val="18"/>
+              </w:rPr>
+              <w:t>T0</w:t>
+            </w:r>
+          </w:p>
+        </w:tc>
+        <w:tc>
+          <w:tcPr>
+            <w:tcW w:type="dxa" w:w="3240"/>
+            <w:vAlign w:val="center"/>
+            <w:tcMar>
+              <w:top w:w="90" w:type="dxa"/>
+              <w:start w:w="90" w:type="dxa"/>
+              <w:bottom w:w="90" w:type="dxa"/>
+              <w:end w:w="90" w:type="dxa"/>
+            </w:tcMar>
+          </w:tcPr>
+          <w:p>
+            <w:pPr>
+              <w:spacing w:after="0"/>
+              <w:jc w:val="left"/>
+            </w:pPr>
+            <w:r>
+              <w:rPr>
+                <w:sz w:val="18"/>
+              </w:rPr>
+              <w:t>After diagnostic mammography and before biopsy</w:t>
+            </w:r>
+          </w:p>
+        </w:tc>
+        <w:tc>
+          <w:tcPr>
+            <w:tcW w:type="dxa" w:w="1512"/>
+            <w:vAlign w:val="center"/>
+            <w:tcMar>
+              <w:top w:w="90" w:type="dxa"/>
+              <w:start w:w="90" w:type="dxa"/>
+              <w:bottom w:w="90" w:type="dxa"/>
+              <w:end w:w="90" w:type="dxa"/>
+            </w:tcMar>
+          </w:tcPr>
+          <w:p>
+            <w:pPr>
+              <w:spacing w:after="0"/>
+              <w:jc w:val="center"/>
+            </w:pPr>
+            <w:r>
+              <w:rPr>
+                <w:sz w:val="18"/>
+              </w:rPr>
+              <w:t>Required</w:t>
+            </w:r>
+          </w:p>
+        </w:tc>
+        <w:tc>
+          <w:tcPr>
+            <w:tcW w:type="dxa" w:w="3816"/>
+            <w:vAlign w:val="center"/>
+            <w:tcMar>
+              <w:top w:w="90" w:type="dxa"/>
+              <w:start w:w="90" w:type="dxa"/>
+              <w:bottom w:w="90" w:type="dxa"/>
+              <w:end w:w="90" w:type="dxa"/>
+            </w:tcMar>
+          </w:tcPr>
+          <w:p>
+            <w:pPr>
+              <w:spacing w:after="0"/>
+              <w:jc w:val="left"/>
+            </w:pPr>
+            <w:r>
+              <w:rPr>
+                <w:sz w:val="18"/>
+              </w:rPr>
+              <w:t>Product baseline before invasive intervention</w:t>
+            </w:r>
+          </w:p>
+        </w:tc>
+      </w:tr>
+      <w:tr>
+        <w:trPr>
+          <w:cantSplit/>
+        </w:trPr>
+        <w:tc>
+          <w:tcPr>
+            <w:tcW w:type="dxa" w:w="792"/>
+            <w:vAlign w:val="center"/>
+            <w:tcMar>
+              <w:top w:w="90" w:type="dxa"/>
+              <w:start w:w="90" w:type="dxa"/>
+              <w:bottom w:w="90" w:type="dxa"/>
+              <w:end w:w="90" w:type="dxa"/>
+            </w:tcMar>
+          </w:tcPr>
+          <w:p>
+            <w:pPr>
+              <w:spacing w:after="0"/>
+              <w:jc w:val="center"/>
+            </w:pPr>
+            <w:r>
+              <w:rPr>
+                <w:sz w:val="18"/>
+              </w:rPr>
+              <w:t>T1</w:t>
+            </w:r>
+          </w:p>
+        </w:tc>
+        <w:tc>
+          <w:tcPr>
+            <w:tcW w:type="dxa" w:w="3240"/>
+            <w:vAlign w:val="center"/>
+            <w:tcMar>
+              <w:top w:w="90" w:type="dxa"/>
+              <w:start w:w="90" w:type="dxa"/>
+              <w:bottom w:w="90" w:type="dxa"/>
+              <w:end w:w="90" w:type="dxa"/>
+            </w:tcMar>
+          </w:tcPr>
+          <w:p>
+            <w:pPr>
+              <w:spacing w:after="0"/>
+              <w:jc w:val="left"/>
+            </w:pPr>
+            <w:r>
+              <w:rPr>
+                <w:sz w:val="18"/>
+              </w:rPr>
+              <w:t>Immediately before biopsy, before needle insertion</w:t>
+            </w:r>
+          </w:p>
+        </w:tc>
+        <w:tc>
+          <w:tcPr>
+            <w:tcW w:type="dxa" w:w="1512"/>
+            <w:vAlign w:val="center"/>
+            <w:tcMar>
+              <w:top w:w="90" w:type="dxa"/>
+              <w:start w:w="90" w:type="dxa"/>
+              <w:bottom w:w="90" w:type="dxa"/>
+              <w:end w:w="90" w:type="dxa"/>
+            </w:tcMar>
+          </w:tcPr>
+          <w:p>
+            <w:pPr>
+              <w:spacing w:after="0"/>
+              <w:jc w:val="center"/>
+            </w:pPr>
+            <w:r>
+              <w:rPr>
+                <w:sz w:val="18"/>
+              </w:rPr>
+              <w:t>High priority</w:t>
+            </w:r>
+          </w:p>
+        </w:tc>
+        <w:tc>
+          <w:tcPr>
+            <w:tcW w:type="dxa" w:w="3816"/>
+            <w:vAlign w:val="center"/>
+            <w:tcMar>
+              <w:top w:w="90" w:type="dxa"/>
+              <w:start w:w="90" w:type="dxa"/>
+              <w:bottom w:w="90" w:type="dxa"/>
+              <w:end w:w="90" w:type="dxa"/>
+            </w:tcMar>
+          </w:tcPr>
+          <w:p>
+            <w:pPr>
+              <w:spacing w:after="0"/>
+              <w:jc w:val="left"/>
+            </w:pPr>
+            <w:r>
+              <w:rPr>
+                <w:sz w:val="18"/>
+              </w:rPr>
+              <w:t>Second pre-biopsy observation and short-term dynamics</w:t>
+            </w:r>
+          </w:p>
+        </w:tc>
+      </w:tr>
+      <w:tr>
+        <w:trPr>
+          <w:cantSplit/>
+        </w:trPr>
+        <w:tc>
+          <w:tcPr>
+            <w:tcW w:type="dxa" w:w="792"/>
+            <w:vAlign w:val="center"/>
+            <w:tcMar>
+              <w:top w:w="90" w:type="dxa"/>
+              <w:start w:w="90" w:type="dxa"/>
+              <w:bottom w:w="90" w:type="dxa"/>
+              <w:end w:w="90" w:type="dxa"/>
+            </w:tcMar>
+          </w:tcPr>
+          <w:p>
+            <w:pPr>
+              <w:spacing w:after="0"/>
+              <w:jc w:val="center"/>
+            </w:pPr>
+            <w:r>
+              <w:rPr>
+                <w:sz w:val="18"/>
+              </w:rPr>
+              <w:t>T2</w:t>
+            </w:r>
+          </w:p>
+        </w:tc>
+        <w:tc>
+          <w:tcPr>
+            <w:tcW w:type="dxa" w:w="3240"/>
+            <w:vAlign w:val="center"/>
+            <w:tcMar>
+              <w:top w:w="90" w:type="dxa"/>
+              <w:start w:w="90" w:type="dxa"/>
+              <w:bottom w:w="90" w:type="dxa"/>
+              <w:end w:w="90" w:type="dxa"/>
+            </w:tcMar>
+          </w:tcPr>
+          <w:p>
+            <w:pPr>
+              <w:spacing w:after="0"/>
+              <w:jc w:val="left"/>
+            </w:pPr>
+            <w:r>
+              <w:rPr>
+                <w:sz w:val="18"/>
+              </w:rPr>
+              <w:t>Approximately 1 week after biopsy</w:t>
+            </w:r>
+          </w:p>
+        </w:tc>
+        <w:tc>
+          <w:tcPr>
+            <w:tcW w:type="dxa" w:w="1512"/>
+            <w:vAlign w:val="center"/>
+            <w:tcMar>
+              <w:top w:w="90" w:type="dxa"/>
+              <w:start w:w="90" w:type="dxa"/>
+              <w:bottom w:w="90" w:type="dxa"/>
+              <w:end w:w="90" w:type="dxa"/>
+            </w:tcMar>
+          </w:tcPr>
+          <w:p>
+            <w:pPr>
+              <w:spacing w:after="0"/>
+              <w:jc w:val="center"/>
+            </w:pPr>
+            <w:r>
+              <w:rPr>
+                <w:sz w:val="18"/>
+              </w:rPr>
+              <w:t>Selected subset</w:t>
+            </w:r>
+          </w:p>
+        </w:tc>
+        <w:tc>
+          <w:tcPr>
+            <w:tcW w:type="dxa" w:w="3816"/>
+            <w:vAlign w:val="center"/>
+            <w:tcMar>
+              <w:top w:w="90" w:type="dxa"/>
+              <w:start w:w="90" w:type="dxa"/>
+              <w:bottom w:w="90" w:type="dxa"/>
+              <w:end w:w="90" w:type="dxa"/>
+            </w:tcMar>
+          </w:tcPr>
+          <w:p>
+            <w:pPr>
+              <w:spacing w:after="0"/>
+              <w:jc w:val="left"/>
+            </w:pPr>
+            <w:r>
+              <w:rPr>
+                <w:sz w:val="18"/>
+              </w:rPr>
+              <w:t>Early inflammatory and wound-response trajectory</w:t>
+            </w:r>
+          </w:p>
+        </w:tc>
+      </w:tr>
+    </w:tbl>
+    <w:p>
+      <w:r>
+        <w:br w:type="page"/>
+      </w:r>
+    </w:p>
+    <w:tbl>
+      <w:tblPr>
+        <w:tblW w:type="auto" w:w="0"/>
+        <w:tblLayout w:type="fixed"/>
+        <w:tblLook w:firstColumn="1" w:firstRow="1" w:lastColumn="0" w:lastRow="0" w:noHBand="0" w:noVBand="1" w:val="04A0"/>
+      </w:tblPr>
+      <w:tblGrid>
+        <w:gridCol w:w="2340"/>
+        <w:gridCol w:w="2340"/>
+        <w:gridCol w:w="2340"/>
+        <w:gridCol w:w="2340"/>
+      </w:tblGrid>
+      <w:tr>
+        <w:trPr>
+          <w:tblHeader w:val="true"/>
+          <w:cantSplit/>
+        </w:trPr>
+        <w:tc>
+          <w:tcPr>
+            <w:tcW w:type="dxa" w:w="792"/>
+            <w:vAlign w:val="center"/>
+            <w:shd w:fill="D9EAF7"/>
+            <w:tcMar>
+              <w:top w:w="90" w:type="dxa"/>
+              <w:start w:w="90" w:type="dxa"/>
+              <w:bottom w:w="90" w:type="dxa"/>
+              <w:end w:w="90" w:type="dxa"/>
+            </w:tcMar>
+          </w:tcPr>
+          <w:p>
+            <w:pPr>
+              <w:spacing w:after="0"/>
+              <w:jc w:val="center"/>
+            </w:pPr>
+            <w:r>
+              <w:rPr>
+                <w:b/>
+                <w:sz w:val="18"/>
+              </w:rPr>
+              <w:t>Timepoint</w:t>
+            </w:r>
+          </w:p>
+        </w:tc>
+        <w:tc>
+          <w:tcPr>
+            <w:tcW w:type="dxa" w:w="3240"/>
+            <w:vAlign w:val="center"/>
+            <w:shd w:fill="D9EAF7"/>
+            <w:tcMar>
+              <w:top w:w="90" w:type="dxa"/>
+              <w:start w:w="90" w:type="dxa"/>
+              <w:bottom w:w="90" w:type="dxa"/>
+              <w:end w:w="90" w:type="dxa"/>
+            </w:tcMar>
+          </w:tcPr>
+          <w:p>
+            <w:pPr>
+              <w:spacing w:after="0"/>
+              <w:jc w:val="left"/>
+            </w:pPr>
+            <w:r>
+              <w:rPr>
+                <w:b/>
+                <w:sz w:val="18"/>
+              </w:rPr>
+              <w:t>Timing</w:t>
+            </w:r>
+          </w:p>
+        </w:tc>
+        <w:tc>
+          <w:tcPr>
+            <w:tcW w:type="dxa" w:w="1512"/>
+            <w:vAlign w:val="center"/>
+            <w:shd w:fill="D9EAF7"/>
+            <w:tcMar>
+              <w:top w:w="90" w:type="dxa"/>
+              <w:start w:w="90" w:type="dxa"/>
+              <w:bottom w:w="90" w:type="dxa"/>
+              <w:end w:w="90" w:type="dxa"/>
+            </w:tcMar>
+          </w:tcPr>
+          <w:p>
+            <w:pPr>
+              <w:spacing w:after="0"/>
+              <w:jc w:val="center"/>
+            </w:pPr>
+            <w:r>
+              <w:rPr>
+                <w:b/>
+                <w:sz w:val="18"/>
+              </w:rPr>
+              <w:t>Priority</w:t>
+            </w:r>
+          </w:p>
+        </w:tc>
+        <w:tc>
+          <w:tcPr>
+            <w:tcW w:type="dxa" w:w="3816"/>
+            <w:vAlign w:val="center"/>
+            <w:shd w:fill="D9EAF7"/>
+            <w:tcMar>
+              <w:top w:w="90" w:type="dxa"/>
+              <w:start w:w="90" w:type="dxa"/>
+              <w:bottom w:w="90" w:type="dxa"/>
+              <w:end w:w="90" w:type="dxa"/>
+            </w:tcMar>
+          </w:tcPr>
+          <w:p>
+            <w:pPr>
+              <w:spacing w:after="0"/>
+              <w:jc w:val="left"/>
+            </w:pPr>
+            <w:r>
+              <w:rPr>
+                <w:b/>
+                <w:sz w:val="18"/>
+              </w:rPr>
+              <w:t>Purpose</w:t>
+            </w:r>
+          </w:p>
+        </w:tc>
+      </w:tr>
+      <w:tr>
+        <w:trPr>
+          <w:cantSplit/>
+        </w:trPr>
+        <w:tc>
+          <w:tcPr>
+            <w:tcW w:type="dxa" w:w="792"/>
+            <w:vAlign w:val="center"/>
+            <w:tcMar>
+              <w:top w:w="90" w:type="dxa"/>
+              <w:start w:w="90" w:type="dxa"/>
+              <w:bottom w:w="90" w:type="dxa"/>
+              <w:end w:w="90" w:type="dxa"/>
+            </w:tcMar>
+          </w:tcPr>
+          <w:p>
+            <w:pPr>
+              <w:spacing w:after="0"/>
+              <w:jc w:val="center"/>
+            </w:pPr>
+            <w:r>
+              <w:rPr>
+                <w:sz w:val="18"/>
+              </w:rPr>
+              <w:t>T3</w:t>
+            </w:r>
+          </w:p>
+        </w:tc>
+        <w:tc>
+          <w:tcPr>
+            <w:tcW w:type="dxa" w:w="3240"/>
+            <w:vAlign w:val="center"/>
+            <w:tcMar>
+              <w:top w:w="90" w:type="dxa"/>
+              <w:start w:w="90" w:type="dxa"/>
+              <w:bottom w:w="90" w:type="dxa"/>
+              <w:end w:w="90" w:type="dxa"/>
+            </w:tcMar>
+          </w:tcPr>
+          <w:p>
+            <w:pPr>
+              <w:spacing w:after="0"/>
+              <w:jc w:val="left"/>
+            </w:pPr>
+            <w:r>
+              <w:rPr>
+                <w:sz w:val="18"/>
+              </w:rPr>
+              <w:t>Approximately 2 weeks after biopsy and before treatment when feasible</w:t>
+            </w:r>
+          </w:p>
+        </w:tc>
+        <w:tc>
+          <w:tcPr>
+            <w:tcW w:type="dxa" w:w="1512"/>
+            <w:vAlign w:val="center"/>
+            <w:tcMar>
+              <w:top w:w="90" w:type="dxa"/>
+              <w:start w:w="90" w:type="dxa"/>
+              <w:bottom w:w="90" w:type="dxa"/>
+              <w:end w:w="90" w:type="dxa"/>
+            </w:tcMar>
+          </w:tcPr>
+          <w:p>
+            <w:pPr>
+              <w:spacing w:after="0"/>
+              <w:jc w:val="center"/>
+            </w:pPr>
+            <w:r>
+              <w:rPr>
+                <w:sz w:val="18"/>
+              </w:rPr>
+              <w:t>Selected subset</w:t>
+            </w:r>
+          </w:p>
+        </w:tc>
+        <w:tc>
+          <w:tcPr>
+            <w:tcW w:type="dxa" w:w="3816"/>
+            <w:vAlign w:val="center"/>
+            <w:tcMar>
+              <w:top w:w="90" w:type="dxa"/>
+              <w:start w:w="90" w:type="dxa"/>
+              <w:bottom w:w="90" w:type="dxa"/>
+              <w:end w:w="90" w:type="dxa"/>
+            </w:tcMar>
+          </w:tcPr>
+          <w:p>
+            <w:pPr>
+              <w:spacing w:after="0"/>
+              <w:jc w:val="left"/>
+            </w:pPr>
+            <w:r>
+              <w:rPr>
+                <w:sz w:val="18"/>
+              </w:rPr>
+              <w:t>Persistence or resolution of biopsy-related changes</w:t>
+            </w:r>
+          </w:p>
+        </w:tc>
+      </w:tr>
+      <w:tr>
+        <w:trPr>
+          <w:cantSplit/>
+        </w:trPr>
+        <w:tc>
+          <w:tcPr>
+            <w:tcW w:type="dxa" w:w="792"/>
+            <w:vAlign w:val="center"/>
+            <w:tcMar>
+              <w:top w:w="90" w:type="dxa"/>
+              <w:start w:w="90" w:type="dxa"/>
+              <w:bottom w:w="90" w:type="dxa"/>
+              <w:end w:w="90" w:type="dxa"/>
+            </w:tcMar>
+          </w:tcPr>
+          <w:p>
+            <w:pPr>
+              <w:spacing w:after="0"/>
+              <w:jc w:val="center"/>
+            </w:pPr>
+            <w:r>
+              <w:rPr>
+                <w:sz w:val="18"/>
+              </w:rPr>
+              <w:t>T4</w:t>
+            </w:r>
+          </w:p>
+        </w:tc>
+        <w:tc>
+          <w:tcPr>
+            <w:tcW w:type="dxa" w:w="3240"/>
+            <w:vAlign w:val="center"/>
+            <w:tcMar>
+              <w:top w:w="90" w:type="dxa"/>
+              <w:start w:w="90" w:type="dxa"/>
+              <w:bottom w:w="90" w:type="dxa"/>
+              <w:end w:w="90" w:type="dxa"/>
+            </w:tcMar>
+          </w:tcPr>
+          <w:p>
+            <w:pPr>
+              <w:spacing w:after="0"/>
+              <w:jc w:val="left"/>
+            </w:pPr>
+            <w:r>
+              <w:rPr>
+                <w:sz w:val="18"/>
+              </w:rPr>
+              <w:t>Immediately before treatment starts</w:t>
+            </w:r>
+          </w:p>
+        </w:tc>
+        <w:tc>
+          <w:tcPr>
+            <w:tcW w:type="dxa" w:w="1512"/>
+            <w:vAlign w:val="center"/>
+            <w:tcMar>
+              <w:top w:w="90" w:type="dxa"/>
+              <w:start w:w="90" w:type="dxa"/>
+              <w:bottom w:w="90" w:type="dxa"/>
+              <w:end w:w="90" w:type="dxa"/>
+            </w:tcMar>
+          </w:tcPr>
+          <w:p>
+            <w:pPr>
+              <w:spacing w:after="0"/>
+              <w:jc w:val="center"/>
+            </w:pPr>
+            <w:r>
+              <w:rPr>
+                <w:sz w:val="18"/>
+              </w:rPr>
+              <w:t>Preferred</w:t>
+            </w:r>
+          </w:p>
+        </w:tc>
+        <w:tc>
+          <w:tcPr>
+            <w:tcW w:type="dxa" w:w="3816"/>
+            <w:vAlign w:val="center"/>
+            <w:tcMar>
+              <w:top w:w="90" w:type="dxa"/>
+              <w:start w:w="90" w:type="dxa"/>
+              <w:bottom w:w="90" w:type="dxa"/>
+              <w:end w:w="90" w:type="dxa"/>
+            </w:tcMar>
+          </w:tcPr>
+          <w:p>
+            <w:pPr>
+              <w:spacing w:after="0"/>
+              <w:jc w:val="left"/>
+            </w:pPr>
+            <w:r>
+              <w:rPr>
+                <w:sz w:val="18"/>
+              </w:rPr>
+              <w:t>Pretreatment baseline</w:t>
+            </w:r>
+          </w:p>
+        </w:tc>
+      </w:tr>
+      <w:tr>
+        <w:trPr>
+          <w:cantSplit/>
+        </w:trPr>
+        <w:tc>
+          <w:tcPr>
+            <w:tcW w:type="dxa" w:w="792"/>
+            <w:vAlign w:val="center"/>
+            <w:tcMar>
+              <w:top w:w="90" w:type="dxa"/>
+              <w:start w:w="90" w:type="dxa"/>
+              <w:bottom w:w="90" w:type="dxa"/>
+              <w:end w:w="90" w:type="dxa"/>
+            </w:tcMar>
+          </w:tcPr>
+          <w:p>
+            <w:pPr>
+              <w:spacing w:after="0"/>
+              <w:jc w:val="center"/>
+            </w:pPr>
+            <w:r>
+              <w:rPr>
+                <w:sz w:val="18"/>
+              </w:rPr>
+              <w:t>T5</w:t>
+            </w:r>
+          </w:p>
+        </w:tc>
+        <w:tc>
+          <w:tcPr>
+            <w:tcW w:type="dxa" w:w="3240"/>
+            <w:vAlign w:val="center"/>
+            <w:tcMar>
+              <w:top w:w="90" w:type="dxa"/>
+              <w:start w:w="90" w:type="dxa"/>
+              <w:bottom w:w="90" w:type="dxa"/>
+              <w:end w:w="90" w:type="dxa"/>
+            </w:tcMar>
+          </w:tcPr>
+          <w:p>
+            <w:pPr>
+              <w:spacing w:after="0"/>
+              <w:jc w:val="left"/>
+            </w:pPr>
+            <w:r>
+              <w:rPr>
+                <w:sz w:val="18"/>
+              </w:rPr>
+              <w:t>At protocol-defined milestones during treatment</w:t>
+            </w:r>
+          </w:p>
+        </w:tc>
+        <w:tc>
+          <w:tcPr>
+            <w:tcW w:type="dxa" w:w="1512"/>
+            <w:vAlign w:val="center"/>
+            <w:tcMar>
+              <w:top w:w="90" w:type="dxa"/>
+              <w:start w:w="90" w:type="dxa"/>
+              <w:bottom w:w="90" w:type="dxa"/>
+              <w:end w:w="90" w:type="dxa"/>
+            </w:tcMar>
+          </w:tcPr>
+          <w:p>
+            <w:pPr>
+              <w:spacing w:after="0"/>
+              <w:jc w:val="center"/>
+            </w:pPr>
+            <w:r>
+              <w:rPr>
+                <w:sz w:val="18"/>
+              </w:rPr>
+              <w:t>Research</w:t>
+            </w:r>
+          </w:p>
+        </w:tc>
+        <w:tc>
+          <w:tcPr>
+            <w:tcW w:type="dxa" w:w="3816"/>
+            <w:vAlign w:val="center"/>
+            <w:tcMar>
+              <w:top w:w="90" w:type="dxa"/>
+              <w:start w:w="90" w:type="dxa"/>
+              <w:bottom w:w="90" w:type="dxa"/>
+              <w:end w:w="90" w:type="dxa"/>
+            </w:tcMar>
+          </w:tcPr>
+          <w:p>
+            <w:pPr>
+              <w:spacing w:after="0"/>
+              <w:jc w:val="left"/>
+            </w:pPr>
+            <w:r>
+              <w:rPr>
+                <w:sz w:val="18"/>
+              </w:rPr>
+              <w:t>Treatment-response dynamics</w:t>
+            </w:r>
+          </w:p>
+        </w:tc>
+      </w:tr>
+      <w:tr>
+        <w:trPr>
+          <w:cantSplit/>
+        </w:trPr>
+        <w:tc>
+          <w:tcPr>
+            <w:tcW w:type="dxa" w:w="792"/>
+            <w:vAlign w:val="center"/>
+            <w:tcMar>
+              <w:top w:w="90" w:type="dxa"/>
+              <w:start w:w="90" w:type="dxa"/>
+              <w:bottom w:w="90" w:type="dxa"/>
+              <w:end w:w="90" w:type="dxa"/>
+            </w:tcMar>
+          </w:tcPr>
+          <w:p>
+            <w:pPr>
+              <w:spacing w:after="0"/>
+              <w:jc w:val="center"/>
+            </w:pPr>
+            <w:r>
+              <w:rPr>
+                <w:sz w:val="18"/>
+              </w:rPr>
+              <w:t>T6</w:t>
+            </w:r>
+          </w:p>
+        </w:tc>
+        <w:tc>
+          <w:tcPr>
+            <w:tcW w:type="dxa" w:w="3240"/>
+            <w:vAlign w:val="center"/>
+            <w:tcMar>
+              <w:top w:w="90" w:type="dxa"/>
+              <w:start w:w="90" w:type="dxa"/>
+              <w:bottom w:w="90" w:type="dxa"/>
+              <w:end w:w="90" w:type="dxa"/>
+            </w:tcMar>
+          </w:tcPr>
+          <w:p>
+            <w:pPr>
+              <w:spacing w:after="0"/>
+              <w:jc w:val="left"/>
+            </w:pPr>
+            <w:r>
+              <w:rPr>
+                <w:sz w:val="18"/>
+              </w:rPr>
+              <w:t>After treatment completion</w:t>
+            </w:r>
+          </w:p>
+        </w:tc>
+        <w:tc>
+          <w:tcPr>
+            <w:tcW w:type="dxa" w:w="1512"/>
+            <w:vAlign w:val="center"/>
+            <w:tcMar>
+              <w:top w:w="90" w:type="dxa"/>
+              <w:start w:w="90" w:type="dxa"/>
+              <w:bottom w:w="90" w:type="dxa"/>
+              <w:end w:w="90" w:type="dxa"/>
+            </w:tcMar>
+          </w:tcPr>
+          <w:p>
+            <w:pPr>
+              <w:spacing w:after="0"/>
+              <w:jc w:val="center"/>
+            </w:pPr>
+            <w:r>
+              <w:rPr>
+                <w:sz w:val="18"/>
+              </w:rPr>
+              <w:t>Research</w:t>
+            </w:r>
+          </w:p>
+        </w:tc>
+        <w:tc>
+          <w:tcPr>
+            <w:tcW w:type="dxa" w:w="3816"/>
+            <w:vAlign w:val="center"/>
+            <w:tcMar>
+              <w:top w:w="90" w:type="dxa"/>
+              <w:start w:w="90" w:type="dxa"/>
+              <w:bottom w:w="90" w:type="dxa"/>
+              <w:end w:w="90" w:type="dxa"/>
+            </w:tcMar>
+          </w:tcPr>
+          <w:p>
+            <w:pPr>
+              <w:spacing w:after="0"/>
+              <w:jc w:val="left"/>
+            </w:pPr>
+            <w:r>
+              <w:rPr>
+                <w:sz w:val="18"/>
+              </w:rPr>
+              <w:t>Post-treatment state and recovery</w:t>
+            </w:r>
+          </w:p>
+        </w:tc>
+      </w:tr>
+    </w:tbl>
+    <w:p>
+      <w:pPr/>
+      <w:r>
+        <w:t>The T2-T6 observations are a separate longitudinal research dataset. They must not be used as inputs to the current pre-biopsy product model or mixed into its blind validation cohort. Their purpose is to quantify biopsy-related inflammation, treatment effects and future temporal biomarkers.</w:t>
+      </w:r>
+    </w:p>
+    <w:p>
+      <w:pPr/>
+      <w:r>
+        <w:t>Every longitudinal session should record exact acquisition time and intervals from mammography, biopsy and treatment; biopsy type and anatomical site; target-breast location; treatment status; attenuation coefficient; SNR; medication and major clinical events that could affect inflammation.</w:t>
+      </w:r>
+    </w:p>
+    <w:p>
+      <w:pPr/>
+      <w:r>
+        <w:t>If full longitudinal follow-up is operationally impossible, the minimum priority is T0/T1 before biopsy. A smaller consented subset should then be retained for T2 and T3, because post-biopsy measurements are the only direct way to characterize the inflammatory signal introduced by tissue sampling before treatment begins.</w:t>
+      </w:r>
+    </w:p>
+    <w:p>
+      <w:pPr>
+        <w:pStyle w:val="Heading1"/>
+      </w:pPr>
+      <w:r>
+        <w:t>9. Prospective sequence</w:t>
       </w:r>
     </w:p>
     <w:p>
@@ -1403,6 +2483,14 @@
       </w:pPr>
       <w:r>
         <w:t>Collect the development cohort. Permit only predefined analysis and tuning within this cohort.</w:t>
+      </w:r>
+    </w:p>
+    <w:p>
+      <w:pPr>
+        <w:pStyle w:val="ListNumber"/>
+      </w:pPr>
+      <w:r>
+        <w:t>Review development accrual in prespecified 50-patient increments. Record data quality, cohort composition, patient-safe evaluation metrics and evidence for or against a learning plateau.</w:t>
       </w:r>
     </w:p>
     <w:p>
@@ -1450,7 +2538,7 @@
         <w:pStyle w:val="Heading1"/>
       </w:pPr>
       <w:r>
-        <w:t>7. Minimum prospective data contract</w:t>
+        <w:t>10. Minimum prospective data contract</w:t>
       </w:r>
     </w:p>
     <w:tbl>
@@ -1474,17 +2562,20 @@
       </w:tblGrid>
       <w:tr>
         <w:trPr>
-          <w:tblHeader/>
+          <w:tblHeader w:val="true"/>
+          <w:cantSplit/>
         </w:trPr>
         <w:tc>
           <w:tcPr>
             <w:tcW w:w="1900" w:type="dxa"/>
             <w:shd w:val="clear" w:color="auto" w:fill="FFFFFF"/>
             <w:tcMar>
-              <w:top w:w="100" w:type="dxa"/>
+              <w:top w:w="90" w:type="dxa"/>
               <w:left w:w="120" w:type="dxa"/>
-              <w:bottom w:w="100" w:type="dxa"/>
+              <w:bottom w:w="90" w:type="dxa"/>
               <w:right w:w="120" w:type="dxa"/>
+              <w:start w:w="90" w:type="dxa"/>
+              <w:end w:w="90" w:type="dxa"/>
             </w:tcMar>
             <w:vAlign w:val="center"/>
           </w:tcPr>
@@ -1506,10 +2597,12 @@
             <w:tcW w:w="7460" w:type="dxa"/>
             <w:shd w:val="clear" w:color="auto" w:fill="FFFFFF"/>
             <w:tcMar>
-              <w:top w:w="100" w:type="dxa"/>
+              <w:top w:w="90" w:type="dxa"/>
               <w:left w:w="120" w:type="dxa"/>
-              <w:bottom w:w="100" w:type="dxa"/>
+              <w:bottom w:w="90" w:type="dxa"/>
               <w:right w:w="120" w:type="dxa"/>
+              <w:start w:w="90" w:type="dxa"/>
+              <w:end w:w="90" w:type="dxa"/>
             </w:tcMar>
             <w:vAlign w:val="center"/>
           </w:tcPr>
@@ -1528,15 +2621,20 @@
         </w:tc>
       </w:tr>
       <w:tr>
+        <w:trPr>
+          <w:cantSplit/>
+        </w:trPr>
         <w:tc>
           <w:tcPr>
             <w:tcW w:w="1900" w:type="dxa"/>
             <w:shd w:val="clear" w:color="auto" w:fill="FFFFFF"/>
             <w:tcMar>
-              <w:top w:w="100" w:type="dxa"/>
+              <w:top w:w="90" w:type="dxa"/>
               <w:left w:w="120" w:type="dxa"/>
-              <w:bottom w:w="100" w:type="dxa"/>
+              <w:bottom w:w="90" w:type="dxa"/>
               <w:right w:w="120" w:type="dxa"/>
+              <w:start w:w="90" w:type="dxa"/>
+              <w:end w:w="90" w:type="dxa"/>
             </w:tcMar>
             <w:vAlign w:val="center"/>
           </w:tcPr>
@@ -1557,10 +2655,12 @@
             <w:tcW w:w="7460" w:type="dxa"/>
             <w:shd w:val="clear" w:color="auto" w:fill="FFFFFF"/>
             <w:tcMar>
-              <w:top w:w="100" w:type="dxa"/>
+              <w:top w:w="90" w:type="dxa"/>
               <w:left w:w="120" w:type="dxa"/>
-              <w:bottom w:w="100" w:type="dxa"/>
+              <w:bottom w:w="90" w:type="dxa"/>
               <w:right w:w="120" w:type="dxa"/>
+              <w:start w:w="90" w:type="dxa"/>
+              <w:end w:w="90" w:type="dxa"/>
             </w:tcMar>
             <w:vAlign w:val="center"/>
           </w:tcPr>
@@ -1578,15 +2678,20 @@
         </w:tc>
       </w:tr>
       <w:tr>
+        <w:trPr>
+          <w:cantSplit/>
+        </w:trPr>
         <w:tc>
           <w:tcPr>
             <w:tcW w:w="1900" w:type="dxa"/>
             <w:shd w:val="clear" w:color="auto" w:fill="FFFFFF"/>
             <w:tcMar>
-              <w:top w:w="100" w:type="dxa"/>
+              <w:top w:w="90" w:type="dxa"/>
               <w:left w:w="120" w:type="dxa"/>
-              <w:bottom w:w="100" w:type="dxa"/>
+              <w:bottom w:w="90" w:type="dxa"/>
               <w:right w:w="120" w:type="dxa"/>
+              <w:start w:w="90" w:type="dxa"/>
+              <w:end w:w="90" w:type="dxa"/>
             </w:tcMar>
             <w:vAlign w:val="center"/>
           </w:tcPr>
@@ -1607,10 +2712,12 @@
             <w:tcW w:w="7460" w:type="dxa"/>
             <w:shd w:val="clear" w:color="auto" w:fill="FFFFFF"/>
             <w:tcMar>
-              <w:top w:w="100" w:type="dxa"/>
+              <w:top w:w="90" w:type="dxa"/>
               <w:left w:w="120" w:type="dxa"/>
-              <w:bottom w:w="100" w:type="dxa"/>
+              <w:bottom w:w="90" w:type="dxa"/>
               <w:right w:w="120" w:type="dxa"/>
+              <w:start w:w="90" w:type="dxa"/>
+              <w:end w:w="90" w:type="dxa"/>
             </w:tcMar>
             <w:vAlign w:val="center"/>
           </w:tcPr>
@@ -1628,15 +2735,20 @@
         </w:tc>
       </w:tr>
       <w:tr>
+        <w:trPr>
+          <w:cantSplit/>
+        </w:trPr>
         <w:tc>
           <w:tcPr>
             <w:tcW w:w="1900" w:type="dxa"/>
             <w:shd w:val="clear" w:color="auto" w:fill="FFFFFF"/>
             <w:tcMar>
-              <w:top w:w="100" w:type="dxa"/>
+              <w:top w:w="90" w:type="dxa"/>
               <w:left w:w="120" w:type="dxa"/>
-              <w:bottom w:w="100" w:type="dxa"/>
+              <w:bottom w:w="90" w:type="dxa"/>
               <w:right w:w="120" w:type="dxa"/>
+              <w:start w:w="90" w:type="dxa"/>
+              <w:end w:w="90" w:type="dxa"/>
             </w:tcMar>
             <w:vAlign w:val="center"/>
           </w:tcPr>
@@ -1657,10 +2769,12 @@
             <w:tcW w:w="7460" w:type="dxa"/>
             <w:shd w:val="clear" w:color="auto" w:fill="FFFFFF"/>
             <w:tcMar>
-              <w:top w:w="100" w:type="dxa"/>
+              <w:top w:w="90" w:type="dxa"/>
               <w:left w:w="120" w:type="dxa"/>
-              <w:bottom w:w="100" w:type="dxa"/>
+              <w:bottom w:w="90" w:type="dxa"/>
               <w:right w:w="120" w:type="dxa"/>
+              <w:start w:w="90" w:type="dxa"/>
+              <w:end w:w="90" w:type="dxa"/>
             </w:tcMar>
             <w:vAlign w:val="center"/>
           </w:tcPr>
@@ -1678,15 +2792,20 @@
         </w:tc>
       </w:tr>
       <w:tr>
+        <w:trPr>
+          <w:cantSplit/>
+        </w:trPr>
         <w:tc>
           <w:tcPr>
             <w:tcW w:w="1900" w:type="dxa"/>
             <w:shd w:val="clear" w:color="auto" w:fill="FFFFFF"/>
             <w:tcMar>
-              <w:top w:w="100" w:type="dxa"/>
+              <w:top w:w="90" w:type="dxa"/>
               <w:left w:w="120" w:type="dxa"/>
-              <w:bottom w:w="100" w:type="dxa"/>
+              <w:bottom w:w="90" w:type="dxa"/>
               <w:right w:w="120" w:type="dxa"/>
+              <w:start w:w="90" w:type="dxa"/>
+              <w:end w:w="90" w:type="dxa"/>
             </w:tcMar>
             <w:vAlign w:val="center"/>
           </w:tcPr>
@@ -1707,10 +2826,12 @@
             <w:tcW w:w="7460" w:type="dxa"/>
             <w:shd w:val="clear" w:color="auto" w:fill="FFFFFF"/>
             <w:tcMar>
-              <w:top w:w="100" w:type="dxa"/>
+              <w:top w:w="90" w:type="dxa"/>
               <w:left w:w="120" w:type="dxa"/>
-              <w:bottom w:w="100" w:type="dxa"/>
+              <w:bottom w:w="90" w:type="dxa"/>
               <w:right w:w="120" w:type="dxa"/>
+              <w:start w:w="90" w:type="dxa"/>
+              <w:end w:w="90" w:type="dxa"/>
             </w:tcMar>
             <w:vAlign w:val="center"/>
           </w:tcPr>
@@ -1728,15 +2849,20 @@
         </w:tc>
       </w:tr>
       <w:tr>
+        <w:trPr>
+          <w:cantSplit/>
+        </w:trPr>
         <w:tc>
           <w:tcPr>
             <w:tcW w:w="1900" w:type="dxa"/>
             <w:shd w:val="clear" w:color="auto" w:fill="FFFFFF"/>
             <w:tcMar>
-              <w:top w:w="100" w:type="dxa"/>
+              <w:top w:w="90" w:type="dxa"/>
               <w:left w:w="120" w:type="dxa"/>
-              <w:bottom w:w="100" w:type="dxa"/>
+              <w:bottom w:w="90" w:type="dxa"/>
               <w:right w:w="120" w:type="dxa"/>
+              <w:start w:w="90" w:type="dxa"/>
+              <w:end w:w="90" w:type="dxa"/>
             </w:tcMar>
             <w:vAlign w:val="center"/>
           </w:tcPr>
@@ -1758,10 +2884,12 @@
             <w:tcW w:w="7460" w:type="dxa"/>
             <w:shd w:val="clear" w:color="auto" w:fill="FFFFFF"/>
             <w:tcMar>
-              <w:top w:w="100" w:type="dxa"/>
+              <w:top w:w="90" w:type="dxa"/>
               <w:left w:w="120" w:type="dxa"/>
-              <w:bottom w:w="100" w:type="dxa"/>
+              <w:bottom w:w="90" w:type="dxa"/>
               <w:right w:w="120" w:type="dxa"/>
+              <w:start w:w="90" w:type="dxa"/>
+              <w:end w:w="90" w:type="dxa"/>
             </w:tcMar>
             <w:vAlign w:val="center"/>
           </w:tcPr>
@@ -1779,15 +2907,20 @@
         </w:tc>
       </w:tr>
       <w:tr>
+        <w:trPr>
+          <w:cantSplit/>
+        </w:trPr>
         <w:tc>
           <w:tcPr>
             <w:tcW w:w="1900" w:type="dxa"/>
             <w:shd w:val="clear" w:color="auto" w:fill="FFFFFF"/>
             <w:tcMar>
-              <w:top w:w="100" w:type="dxa"/>
+              <w:top w:w="90" w:type="dxa"/>
               <w:left w:w="120" w:type="dxa"/>
-              <w:bottom w:w="100" w:type="dxa"/>
+              <w:bottom w:w="90" w:type="dxa"/>
               <w:right w:w="120" w:type="dxa"/>
+              <w:start w:w="90" w:type="dxa"/>
+              <w:end w:w="90" w:type="dxa"/>
             </w:tcMar>
             <w:vAlign w:val="center"/>
           </w:tcPr>
@@ -1808,10 +2941,12 @@
             <w:tcW w:w="7460" w:type="dxa"/>
             <w:shd w:val="clear" w:color="auto" w:fill="FFFFFF"/>
             <w:tcMar>
-              <w:top w:w="100" w:type="dxa"/>
+              <w:top w:w="90" w:type="dxa"/>
               <w:left w:w="120" w:type="dxa"/>
-              <w:bottom w:w="100" w:type="dxa"/>
+              <w:bottom w:w="90" w:type="dxa"/>
               <w:right w:w="120" w:type="dxa"/>
+              <w:start w:w="90" w:type="dxa"/>
+              <w:end w:w="90" w:type="dxa"/>
             </w:tcMar>
             <w:vAlign w:val="center"/>
           </w:tcPr>
@@ -1828,6 +2963,108 @@
           </w:p>
         </w:tc>
       </w:tr>
+      <w:tr>
+        <w:trPr>
+          <w:cantSplit/>
+        </w:trPr>
+        <w:tc>
+          <w:tcPr>
+            <w:tcW w:type="dxa" w:w="1900"/>
+            <w:vAlign w:val="center"/>
+            <w:tcMar>
+              <w:top w:w="90" w:type="dxa"/>
+              <w:start w:w="90" w:type="dxa"/>
+              <w:bottom w:w="90" w:type="dxa"/>
+              <w:end w:w="90" w:type="dxa"/>
+            </w:tcMar>
+          </w:tcPr>
+          <w:p>
+            <w:pPr>
+              <w:spacing w:after="0"/>
+            </w:pPr>
+            <w:r>
+              <w:rPr>
+                <w:sz w:val="18"/>
+              </w:rPr>
+              <w:t>Clinical timing</w:t>
+            </w:r>
+          </w:p>
+        </w:tc>
+        <w:tc>
+          <w:tcPr>
+            <w:tcW w:type="dxa" w:w="7460"/>
+            <w:vAlign w:val="center"/>
+            <w:tcMar>
+              <w:top w:w="90" w:type="dxa"/>
+              <w:start w:w="90" w:type="dxa"/>
+              <w:bottom w:w="90" w:type="dxa"/>
+              <w:end w:w="90" w:type="dxa"/>
+            </w:tcMar>
+          </w:tcPr>
+          <w:p>
+            <w:pPr>
+              <w:spacing w:after="0"/>
+            </w:pPr>
+            <w:r>
+              <w:rPr>
+                <w:sz w:val="18"/>
+              </w:rPr>
+              <w:t>Mammography, biopsy and treatment dates/times; acquisition timepoint T0-T6; intervals from mammography, biopsy and treatment</w:t>
+            </w:r>
+          </w:p>
+        </w:tc>
+      </w:tr>
+      <w:tr>
+        <w:trPr>
+          <w:cantSplit/>
+        </w:trPr>
+        <w:tc>
+          <w:tcPr>
+            <w:tcW w:type="dxa" w:w="1900"/>
+            <w:vAlign w:val="center"/>
+            <w:tcMar>
+              <w:top w:w="90" w:type="dxa"/>
+              <w:start w:w="90" w:type="dxa"/>
+              <w:bottom w:w="90" w:type="dxa"/>
+              <w:end w:w="90" w:type="dxa"/>
+            </w:tcMar>
+          </w:tcPr>
+          <w:p>
+            <w:pPr>
+              <w:spacing w:after="0"/>
+            </w:pPr>
+            <w:r>
+              <w:rPr>
+                <w:sz w:val="18"/>
+              </w:rPr>
+              <w:t>Longitudinal context</w:t>
+            </w:r>
+          </w:p>
+        </w:tc>
+        <w:tc>
+          <w:tcPr>
+            <w:tcW w:type="dxa" w:w="7460"/>
+            <w:vAlign w:val="center"/>
+            <w:tcMar>
+              <w:top w:w="90" w:type="dxa"/>
+              <w:start w:w="90" w:type="dxa"/>
+              <w:bottom w:w="90" w:type="dxa"/>
+              <w:end w:w="90" w:type="dxa"/>
+            </w:tcMar>
+          </w:tcPr>
+          <w:p>
+            <w:pPr>
+              <w:spacing w:after="0"/>
+            </w:pPr>
+            <w:r>
+              <w:rPr>
+                <w:sz w:val="18"/>
+              </w:rPr>
+              <w:t>Biopsy type and site; treatment status; medication and major inflammatory or clinical events; explicit research-only flag for post-biopsy observations</w:t>
+            </w:r>
+          </w:p>
+        </w:tc>
+      </w:tr>
     </w:tbl>
     <w:p>
       <w:pPr>
@@ -1839,7 +3076,7 @@
         <w:pStyle w:val="Heading1"/>
       </w:pPr>
       <w:r>
-        <w:t>8. FDA-aligned rationale</w:t>
+        <w:t>11. FDA-aligned rationale</w:t>
       </w:r>
     </w:p>
     <w:p>
@@ -1862,17 +3099,24 @@
         <w:pStyle w:val="Heading1"/>
       </w:pPr>
       <w:r>
-        <w:t>9. Recommendation</w:t>
+        <w:t>12. Recommendation</w:t>
       </w:r>
     </w:p>
     <w:p>
+      <w:pPr/>
       <w:r>
-        <w:t>Adopt 1,000 analyzable development patients plus 1,000 independent analyzable blind-validation patients as the working plan. Recruit approximately ten patients per working day to allow for incomplete labels and quality-control losses. Treat 500 + 500 as a pilot scenario and 1,500 + 1,500 as the preferred upper scenario when recruitment capacity permits.</w:t>
+        <w:t>Adopt 1,000 analyzable development patients plus 1,000 independent analyzable blind-validation patients as the working plan. Recruit approximately ten patients per working day to allow for incomplete labels and quality-control losses. Treat 500 + 500 as a pilot scenario and 1,500 + 1,500 as the preferred upper scenario when recruitment capacity permits. Review development data after each additional 50 analyzable patients and use a prospectively defined saturation rule to determine whether collection beyond the working target remains informative.</w:t>
       </w:r>
     </w:p>
     <w:p>
       <w:r>
         <w:t>Before collection starts, fix the intended-use statement, reference-label definition, SNR method and threshold, attenuation-coefficient protocol, patient-level inclusion rules and the statistical success criteria. This step is more important than forcing artificial statistical similarity between the development and blind cohorts.</w:t>
+      </w:r>
+    </w:p>
+    <w:p>
+      <w:pPr/>
+      <w:r>
+        <w:t>Make pre-biopsy acquisition the mandatory clinical baseline. When feasible, collect both a post-mammography session and an immediately pre-biopsy session. Establish a smaller longitudinal subset for post-biopsy weeks 1 and 2, pretreatment, treatment milestones and post-treatment follow-up.</w:t>
       </w:r>
     </w:p>
     <w:p>
@@ -1933,6 +3177,32 @@
           <w:sz w:val="18"/>
         </w:rPr>
         <w:t>U.S. Food and Drug Administration. Artificial Intelligence-Enabled Device Software Functions: Lifecycle Management and Marketing Submission Recommendations. Draft Guidance. January 2025.</w:t>
+      </w:r>
+    </w:p>
+    <w:p>
+      <w:pPr>
+        <w:spacing w:after="100" w:line="252" w:lineRule="auto"/>
+        <w:ind w:left="360" w:hanging="360"/>
+      </w:pPr>
+      <w:r>
+        <w:rPr>
+          <w:color w:val="666666"/>
+          <w:sz w:val="18"/>
+        </w:rPr>
+        <w:t>Wilson EB. Probable Inference, the Law of Succession, and Statistical Inference. Journal of the American Statistical Association. 1927;22(158):209-212.</w:t>
+      </w:r>
+    </w:p>
+    <w:p>
+      <w:pPr>
+        <w:spacing w:after="100" w:line="252" w:lineRule="auto"/>
+        <w:ind w:left="360" w:hanging="360"/>
+      </w:pPr>
+      <w:r>
+        <w:rPr>
+          <w:color w:val="666666"/>
+          <w:sz w:val="18"/>
+        </w:rPr>
+        <w:t>NIST/SEMATECH e-Handbook of Statistical Methods. Section 7.2.4.1: Confidence intervals for a binomial proportion.</w:t>
       </w:r>
     </w:p>
     <w:sectPr>

</xml_diff>